<commit_message>
docs: document local test secrets (FAKE_DB) — clientSecret and payloadKey
- README: 'Pruebas locales' table with test credentials, marked dev-only
- Postman collection pre-loaded with test clientSecret/payloadKey values
- cURL guide (md+docx): explicit test values with dev-only warning
- .env.example kept with empty placeholders; real secrets in Secret Manager

Co-Authored-By: Claude Fable 5 <noreply@anthropic.com>
</commit_message>
<xml_diff>
--- a/docs/testing/Curls-Employee-API-SPI.docx
+++ b/docs/testing/Curls-Employee-API-SPI.docx
@@ -66,6 +66,27 @@
     </w:p>
     <w:p>
       <w:pPr>
+        <w:spacing w:after="120"/>
+        <w:rPr>
+          <w:b/>
+          <w:bCs/>
+          <w:color w:val="B26A00"/>
+        </w:rPr>
+      </w:pPr>
+      <w:r>
+        <w:rPr>
+          <w:rFonts w:ascii="Arial" w:cs="Arial" w:eastAsia="Arial" w:hAnsi="Arial"/>
+          <w:b/>
+          <w:bCs/>
+          <w:color w:val="B26A00"/>
+          <w:sz w:val="22"/>
+          <w:szCs w:val="22"/>
+        </w:rPr>
+        <w:t xml:space="preserve">⚠️ Credenciales SOLO para pruebas locales / demo (modo FAKE_DB). No usar en producción; los secretos reales viven en GCP Secret Manager.</w:t>
+      </w:r>
+    </w:p>
+    <w:p>
+      <w:pPr>
         <w:shd w:fill="1E1E2E" w:val="clear"/>
         <w:spacing w:after="0"/>
         <w:ind w:left="160"/>
@@ -125,7 +146,23 @@
           <w:sz w:val="17"/>
           <w:szCs w:val="17"/>
         </w:rPr>
-        <w:t xml:space="preserve">export CLIENT_SECRET="&lt;secret&gt;"</w:t>
+        <w:t xml:space="preserve">export CLIENT_SECRET="local-secret-2026"       # secreto de prueba local</w:t>
+      </w:r>
+    </w:p>
+    <w:p>
+      <w:pPr>
+        <w:shd w:fill="1E1E2E" w:val="clear"/>
+        <w:spacing w:after="0"/>
+        <w:ind w:left="160"/>
+      </w:pPr>
+      <w:r>
+        <w:rPr>
+          <w:rFonts w:ascii="Consolas" w:cs="Consolas" w:eastAsia="Consolas" w:hAnsi="Consolas"/>
+          <w:color w:val="D8F0D8"/>
+          <w:sz w:val="17"/>
+          <w:szCs w:val="17"/>
+        </w:rPr>
+        <w:t xml:space="preserve">export PAYLOAD_KEY="portal-shared-key-2026"    # passphrase de cifrado (= PAYLOAD_ENCRYPTION_KEY)</w:t>
       </w:r>
     </w:p>
     <w:p>

</xml_diff>